<commit_message>
Changes on the fastapi backend issues already fix. For the frontend, added the estimated cost generation for the generated document and also added README.md.
Next step on the project:
1. Ensure that the word document that is converted to PDF is better bcs the display one looks sucks.
2. Find a way on how can we imporve costing since right now it is hardcoded. Need a much more better way.
</commit_message>
<xml_diff>
--- a/python-backend-deployment/enfrasys_template.docx
+++ b/python-backend-deployment/enfrasys_template.docx
@@ -19,13 +19,13 @@
         <w:tc>
           <w:tcPr>
             <w:cnfStyle w:val="001000000000" w:firstRow="0" w:lastRow="0" w:firstColumn="1" w:lastColumn="0" w:oddVBand="0" w:evenVBand="0" w:oddHBand="0" w:evenHBand="0" w:firstRowFirstColumn="0" w:firstRowLastColumn="0" w:lastRowFirstColumn="0" w:lastRowLastColumn="0"/>
-            <w:tcW w:w="4513" w:type="dxa"/>
+            <w:tcW w:w="4508" w:type="dxa"/>
           </w:tcPr>
           <w:p/>
         </w:tc>
         <w:tc>
           <w:tcPr>
-            <w:tcW w:w="4513" w:type="dxa"/>
+            <w:tcW w:w="4508" w:type="dxa"/>
           </w:tcPr>
           <w:p>
             <w:pPr>
@@ -41,13 +41,13 @@
         <w:tc>
           <w:tcPr>
             <w:cnfStyle w:val="001000000000" w:firstRow="0" w:lastRow="0" w:firstColumn="1" w:lastColumn="0" w:oddVBand="0" w:evenVBand="0" w:oddHBand="0" w:evenHBand="0" w:firstRowFirstColumn="0" w:firstRowLastColumn="0" w:lastRowFirstColumn="0" w:lastRowLastColumn="0"/>
-            <w:tcW w:w="4513" w:type="dxa"/>
+            <w:tcW w:w="4508" w:type="dxa"/>
           </w:tcPr>
           <w:p/>
         </w:tc>
         <w:tc>
           <w:tcPr>
-            <w:tcW w:w="4513" w:type="dxa"/>
+            <w:tcW w:w="4508" w:type="dxa"/>
           </w:tcPr>
           <w:p>
             <w:pPr>
@@ -60,13 +60,54 @@
         <w:tc>
           <w:tcPr>
             <w:cnfStyle w:val="001000000000" w:firstRow="0" w:lastRow="0" w:firstColumn="1" w:lastColumn="0" w:oddVBand="0" w:evenVBand="0" w:oddHBand="0" w:evenHBand="0" w:firstRowFirstColumn="0" w:firstRowLastColumn="0" w:lastRowFirstColumn="0" w:lastRowLastColumn="0"/>
-            <w:tcW w:w="4513" w:type="dxa"/>
+            <w:tcW w:w="4508" w:type="dxa"/>
           </w:tcPr>
           <w:p/>
         </w:tc>
         <w:tc>
           <w:tcPr>
-            <w:tcW w:w="4513" w:type="dxa"/>
+            <w:tcW w:w="4508" w:type="dxa"/>
+          </w:tcPr>
+          <w:p>
+            <w:pPr>
+              <w:cnfStyle w:val="000000000000" w:firstRow="0" w:lastRow="0" w:firstColumn="0" w:lastColumn="0" w:oddVBand="0" w:evenVBand="0" w:oddHBand="0" w:evenHBand="0" w:firstRowFirstColumn="0" w:firstRowLastColumn="0" w:lastRowFirstColumn="0" w:lastRowLastColumn="0"/>
+            </w:pPr>
+          </w:p>
+        </w:tc>
+      </w:tr>
+      <w:tr>
+        <w:trPr>
+          <w:cnfStyle w:val="000000100000" w:firstRow="0" w:lastRow="0" w:firstColumn="0" w:lastColumn="0" w:oddVBand="0" w:evenVBand="0" w:oddHBand="1" w:evenHBand="0" w:firstRowFirstColumn="0" w:firstRowLastColumn="0" w:lastRowFirstColumn="0" w:lastRowLastColumn="0"/>
+        </w:trPr>
+        <w:tc>
+          <w:tcPr>
+            <w:cnfStyle w:val="001000000000" w:firstRow="0" w:lastRow="0" w:firstColumn="1" w:lastColumn="0" w:oddVBand="0" w:evenVBand="0" w:oddHBand="0" w:evenHBand="0" w:firstRowFirstColumn="0" w:firstRowLastColumn="0" w:lastRowFirstColumn="0" w:lastRowLastColumn="0"/>
+            <w:tcW w:w="4508" w:type="dxa"/>
+          </w:tcPr>
+          <w:p/>
+        </w:tc>
+        <w:tc>
+          <w:tcPr>
+            <w:tcW w:w="4508" w:type="dxa"/>
+          </w:tcPr>
+          <w:p>
+            <w:pPr>
+              <w:cnfStyle w:val="000000100000" w:firstRow="0" w:lastRow="0" w:firstColumn="0" w:lastColumn="0" w:oddVBand="0" w:evenVBand="0" w:oddHBand="1" w:evenHBand="0" w:firstRowFirstColumn="0" w:firstRowLastColumn="0" w:lastRowFirstColumn="0" w:lastRowLastColumn="0"/>
+            </w:pPr>
+          </w:p>
+        </w:tc>
+      </w:tr>
+      <w:tr>
+        <w:tc>
+          <w:tcPr>
+            <w:cnfStyle w:val="001000000000" w:firstRow="0" w:lastRow="0" w:firstColumn="1" w:lastColumn="0" w:oddVBand="0" w:evenVBand="0" w:oddHBand="0" w:evenHBand="0" w:firstRowFirstColumn="0" w:firstRowLastColumn="0" w:lastRowFirstColumn="0" w:lastRowLastColumn="0"/>
+            <w:tcW w:w="4508" w:type="dxa"/>
+          </w:tcPr>
+          <w:p/>
+        </w:tc>
+        <w:tc>
+          <w:tcPr>
+            <w:tcW w:w="4508" w:type="dxa"/>
           </w:tcPr>
           <w:p>
             <w:pPr>
@@ -6060,6 +6101,16 @@
 </file>
 
 <file path=customXml/item1.xml><?xml version="1.0" encoding="utf-8"?>
+<p:properties xmlns:p="http://schemas.microsoft.com/office/2006/metadata/properties" xmlns:xsi="http://www.w3.org/2001/XMLSchema-instance" xmlns:pc="http://schemas.microsoft.com/office/infopath/2007/PartnerControls">
+  <documentManagement/>
+</p:properties>
+</file>
+
+<file path=customXml/item2.xml><?xml version="1.0" encoding="utf-8"?>
+<b:Sources xmlns:b="http://schemas.openxmlformats.org/officeDocument/2006/bibliography" xmlns="http://schemas.openxmlformats.org/officeDocument/2006/bibliography" SelectedStyle="\APASixthEditionOfficeOnline.xsl" StyleName="APA" Version="6"/>
+</file>
+
+<file path=customXml/item3.xml><?xml version="1.0" encoding="utf-8"?>
 <ct:contentTypeSchema xmlns:ct="http://schemas.microsoft.com/office/2006/metadata/contentType" xmlns:ma="http://schemas.microsoft.com/office/2006/metadata/properties/metaAttributes" ct:_="" ma:_="" ma:contentTypeName="Document" ma:contentTypeID="0x01010085C90FEABA01574E94F222950F0C31FD" ma:contentTypeVersion="3" ma:contentTypeDescription="Create a new document." ma:contentTypeScope="" ma:versionID="3f74f9d818e6377a773cce7d698d7e32">
   <xsd:schema xmlns:xsd="http://www.w3.org/2001/XMLSchema" xmlns:xs="http://www.w3.org/2001/XMLSchema" xmlns:p="http://schemas.microsoft.com/office/2006/metadata/properties" xmlns:ns2="c10ce1e6-2e59-43d6-bc20-07a30a27bcae" targetNamespace="http://schemas.microsoft.com/office/2006/metadata/properties" ma:root="true" ma:fieldsID="3e16b53508b9ffbab11f7b130802d601" ns2:_="">
     <xsd:import namespace="c10ce1e6-2e59-43d6-bc20-07a30a27bcae"/>
@@ -6197,16 +6248,6 @@
 </ct:contentTypeSchema>
 </file>
 
-<file path=customXml/item2.xml><?xml version="1.0" encoding="utf-8"?>
-<b:Sources xmlns:b="http://schemas.openxmlformats.org/officeDocument/2006/bibliography" xmlns="http://schemas.openxmlformats.org/officeDocument/2006/bibliography" SelectedStyle="\APASixthEditionOfficeOnline.xsl" StyleName="APA" Version="6"/>
-</file>
-
-<file path=customXml/item3.xml><?xml version="1.0" encoding="utf-8"?>
-<p:properties xmlns:p="http://schemas.microsoft.com/office/2006/metadata/properties" xmlns:xsi="http://www.w3.org/2001/XMLSchema-instance" xmlns:pc="http://schemas.microsoft.com/office/infopath/2007/PartnerControls">
-  <documentManagement/>
-</p:properties>
-</file>
-
 <file path=customXml/item4.xml><?xml version="1.0" encoding="utf-8"?>
 <?mso-contentType ?>
 <FormTemplates xmlns="http://schemas.microsoft.com/sharepoint/v3/contenttype/forms">
@@ -6217,6 +6258,23 @@
 </file>
 
 <file path=customXml/itemProps1.xml><?xml version="1.0" encoding="utf-8"?>
+<ds:datastoreItem xmlns:ds="http://schemas.openxmlformats.org/officeDocument/2006/customXml" ds:itemID="{8F70B746-9169-4A9D-BAEC-CBE74BD2F9DF}">
+  <ds:schemaRefs>
+    <ds:schemaRef ds:uri="http://schemas.microsoft.com/office/2006/metadata/properties"/>
+    <ds:schemaRef ds:uri="http://schemas.microsoft.com/office/infopath/2007/PartnerControls"/>
+  </ds:schemaRefs>
+</ds:datastoreItem>
+</file>
+
+<file path=customXml/itemProps2.xml><?xml version="1.0" encoding="utf-8"?>
+<ds:datastoreItem xmlns:ds="http://schemas.openxmlformats.org/officeDocument/2006/customXml" ds:itemID="{A82C1AF4-78FE-4587-AE7C-939CDDF82EB3}">
+  <ds:schemaRefs>
+    <ds:schemaRef ds:uri="http://schemas.openxmlformats.org/officeDocument/2006/bibliography"/>
+  </ds:schemaRefs>
+</ds:datastoreItem>
+</file>
+
+<file path=customXml/itemProps3.xml><?xml version="1.0" encoding="utf-8"?>
 <ds:datastoreItem xmlns:ds="http://schemas.openxmlformats.org/officeDocument/2006/customXml" ds:itemID="{FA55BFAA-E444-45BB-B8D0-8563BE85B483}">
   <ds:schemaRefs>
     <ds:schemaRef ds:uri="http://schemas.microsoft.com/office/2006/metadata/contentType"/>
@@ -6234,23 +6292,6 @@
 </ds:datastoreItem>
 </file>
 
-<file path=customXml/itemProps2.xml><?xml version="1.0" encoding="utf-8"?>
-<ds:datastoreItem xmlns:ds="http://schemas.openxmlformats.org/officeDocument/2006/customXml" ds:itemID="{A82C1AF4-78FE-4587-AE7C-939CDDF82EB3}">
-  <ds:schemaRefs>
-    <ds:schemaRef ds:uri="http://schemas.openxmlformats.org/officeDocument/2006/bibliography"/>
-  </ds:schemaRefs>
-</ds:datastoreItem>
-</file>
-
-<file path=customXml/itemProps3.xml><?xml version="1.0" encoding="utf-8"?>
-<ds:datastoreItem xmlns:ds="http://schemas.openxmlformats.org/officeDocument/2006/customXml" ds:itemID="{8F70B746-9169-4A9D-BAEC-CBE74BD2F9DF}">
-  <ds:schemaRefs>
-    <ds:schemaRef ds:uri="http://schemas.microsoft.com/office/2006/metadata/properties"/>
-    <ds:schemaRef ds:uri="http://schemas.microsoft.com/office/infopath/2007/PartnerControls"/>
-  </ds:schemaRefs>
-</ds:datastoreItem>
-</file>
-
 <file path=customXml/itemProps4.xml><?xml version="1.0" encoding="utf-8"?>
 <ds:datastoreItem xmlns:ds="http://schemas.openxmlformats.org/officeDocument/2006/customXml" ds:itemID="{C93A1584-1F3A-44D1-A14E-32307374A481}">
   <ds:schemaRefs>

</xml_diff>

<commit_message>
Changes to add the risk mitigation and also assessment.
</commit_message>
<xml_diff>
--- a/python-backend-deployment/enfrasys_template.docx
+++ b/python-backend-deployment/enfrasys_template.docx
@@ -19,13 +19,13 @@
         <w:tc>
           <w:tcPr>
             <w:cnfStyle w:val="001000000000" w:firstRow="0" w:lastRow="0" w:firstColumn="1" w:lastColumn="0" w:oddVBand="0" w:evenVBand="0" w:oddHBand="0" w:evenHBand="0" w:firstRowFirstColumn="0" w:firstRowLastColumn="0" w:lastRowFirstColumn="0" w:lastRowLastColumn="0"/>
-            <w:tcW w:w="4508" w:type="dxa"/>
+            <w:tcW w:w="4513" w:type="dxa"/>
           </w:tcPr>
           <w:p/>
         </w:tc>
         <w:tc>
           <w:tcPr>
-            <w:tcW w:w="4508" w:type="dxa"/>
+            <w:tcW w:w="4513" w:type="dxa"/>
           </w:tcPr>
           <w:p>
             <w:pPr>
@@ -41,13 +41,13 @@
         <w:tc>
           <w:tcPr>
             <w:cnfStyle w:val="001000000000" w:firstRow="0" w:lastRow="0" w:firstColumn="1" w:lastColumn="0" w:oddVBand="0" w:evenVBand="0" w:oddHBand="0" w:evenHBand="0" w:firstRowFirstColumn="0" w:firstRowLastColumn="0" w:lastRowFirstColumn="0" w:lastRowLastColumn="0"/>
-            <w:tcW w:w="4508" w:type="dxa"/>
+            <w:tcW w:w="4513" w:type="dxa"/>
           </w:tcPr>
           <w:p/>
         </w:tc>
         <w:tc>
           <w:tcPr>
-            <w:tcW w:w="4508" w:type="dxa"/>
+            <w:tcW w:w="4513" w:type="dxa"/>
           </w:tcPr>
           <w:p>
             <w:pPr>
@@ -60,54 +60,13 @@
         <w:tc>
           <w:tcPr>
             <w:cnfStyle w:val="001000000000" w:firstRow="0" w:lastRow="0" w:firstColumn="1" w:lastColumn="0" w:oddVBand="0" w:evenVBand="0" w:oddHBand="0" w:evenHBand="0" w:firstRowFirstColumn="0" w:firstRowLastColumn="0" w:lastRowFirstColumn="0" w:lastRowLastColumn="0"/>
-            <w:tcW w:w="4508" w:type="dxa"/>
+            <w:tcW w:w="4513" w:type="dxa"/>
           </w:tcPr>
           <w:p/>
         </w:tc>
         <w:tc>
           <w:tcPr>
-            <w:tcW w:w="4508" w:type="dxa"/>
-          </w:tcPr>
-          <w:p>
-            <w:pPr>
-              <w:cnfStyle w:val="000000000000" w:firstRow="0" w:lastRow="0" w:firstColumn="0" w:lastColumn="0" w:oddVBand="0" w:evenVBand="0" w:oddHBand="0" w:evenHBand="0" w:firstRowFirstColumn="0" w:firstRowLastColumn="0" w:lastRowFirstColumn="0" w:lastRowLastColumn="0"/>
-            </w:pPr>
-          </w:p>
-        </w:tc>
-      </w:tr>
-      <w:tr>
-        <w:trPr>
-          <w:cnfStyle w:val="000000100000" w:firstRow="0" w:lastRow="0" w:firstColumn="0" w:lastColumn="0" w:oddVBand="0" w:evenVBand="0" w:oddHBand="1" w:evenHBand="0" w:firstRowFirstColumn="0" w:firstRowLastColumn="0" w:lastRowFirstColumn="0" w:lastRowLastColumn="0"/>
-        </w:trPr>
-        <w:tc>
-          <w:tcPr>
-            <w:cnfStyle w:val="001000000000" w:firstRow="0" w:lastRow="0" w:firstColumn="1" w:lastColumn="0" w:oddVBand="0" w:evenVBand="0" w:oddHBand="0" w:evenHBand="0" w:firstRowFirstColumn="0" w:firstRowLastColumn="0" w:lastRowFirstColumn="0" w:lastRowLastColumn="0"/>
-            <w:tcW w:w="4508" w:type="dxa"/>
-          </w:tcPr>
-          <w:p/>
-        </w:tc>
-        <w:tc>
-          <w:tcPr>
-            <w:tcW w:w="4508" w:type="dxa"/>
-          </w:tcPr>
-          <w:p>
-            <w:pPr>
-              <w:cnfStyle w:val="000000100000" w:firstRow="0" w:lastRow="0" w:firstColumn="0" w:lastColumn="0" w:oddVBand="0" w:evenVBand="0" w:oddHBand="1" w:evenHBand="0" w:firstRowFirstColumn="0" w:firstRowLastColumn="0" w:lastRowFirstColumn="0" w:lastRowLastColumn="0"/>
-            </w:pPr>
-          </w:p>
-        </w:tc>
-      </w:tr>
-      <w:tr>
-        <w:tc>
-          <w:tcPr>
-            <w:cnfStyle w:val="001000000000" w:firstRow="0" w:lastRow="0" w:firstColumn="1" w:lastColumn="0" w:oddVBand="0" w:evenVBand="0" w:oddHBand="0" w:evenHBand="0" w:firstRowFirstColumn="0" w:firstRowLastColumn="0" w:lastRowFirstColumn="0" w:lastRowLastColumn="0"/>
-            <w:tcW w:w="4508" w:type="dxa"/>
-          </w:tcPr>
-          <w:p/>
-        </w:tc>
-        <w:tc>
-          <w:tcPr>
-            <w:tcW w:w="4508" w:type="dxa"/>
+            <w:tcW w:w="4513" w:type="dxa"/>
           </w:tcPr>
           <w:p>
             <w:pPr>
@@ -118,6 +77,51 @@
       </w:tr>
     </w:tbl>
     <w:p/>
+    <w:p>
+      <w:pPr>
+        <w:pStyle w:val="Heading1"/>
+      </w:pPr>
+      <w:r>
+        <w:t>Heading 1</w:t>
+      </w:r>
+    </w:p>
+    <w:p>
+      <w:pPr>
+        <w:pStyle w:val="Heading2"/>
+      </w:pPr>
+      <w:r>
+        <w:t>Heading 2</w:t>
+      </w:r>
+    </w:p>
+    <w:p>
+      <w:pPr>
+        <w:pStyle w:val="Heading3"/>
+      </w:pPr>
+      <w:r>
+        <w:t>Heading 3</w:t>
+      </w:r>
+    </w:p>
+    <w:p>
+      <w:pPr>
+        <w:pStyle w:val="Heading4"/>
+      </w:pPr>
+      <w:r>
+        <w:t>Heading 4</w:t>
+      </w:r>
+    </w:p>
+    <w:p>
+      <w:pPr>
+        <w:pStyle w:val="Heading5"/>
+      </w:pPr>
+      <w:r>
+        <w:t>Heading 5</w:t>
+      </w:r>
+    </w:p>
+    <w:p>
+      <w:r>
+        <w:t>Normal</w:t>
+      </w:r>
+    </w:p>
     <w:p>
       <w:r>
         <w:br w:type="page"/>
@@ -142,9 +146,6 @@
 <w:endnotes xmlns:wpc="http://schemas.microsoft.com/office/word/2010/wordprocessingCanvas" xmlns:cx="http://schemas.microsoft.com/office/drawing/2014/chartex" xmlns:cx1="http://schemas.microsoft.com/office/drawing/2015/9/8/chartex" xmlns:cx2="http://schemas.microsoft.com/office/drawing/2015/10/21/chartex" xmlns:cx3="http://schemas.microsoft.com/office/drawing/2016/5/9/chartex" xmlns:cx4="http://schemas.microsoft.com/office/drawing/2016/5/10/chartex" xmlns:cx5="http://schemas.microsoft.com/office/drawing/2016/5/11/chartex" xmlns:cx6="http://schemas.microsoft.com/office/drawing/2016/5/12/chartex" xmlns:cx7="http://schemas.microsoft.com/office/drawing/2016/5/13/chartex" xmlns:cx8="http://schemas.microsoft.com/office/drawing/2016/5/14/chartex" xmlns:mc="http://schemas.openxmlformats.org/markup-compatibility/2006" xmlns:aink="http://schemas.microsoft.com/office/drawing/2016/ink" xmlns:am3d="http://schemas.microsoft.com/office/drawing/2017/model3d" xmlns:o="urn:schemas-microsoft-com:office:office" xmlns:oel="http://schemas.microsoft.com/office/2019/extlst" xmlns:r="http://schemas.openxmlformats.org/officeDocument/2006/relationships" xmlns:m="http://schemas.openxmlformats.org/officeDocument/2006/math" xmlns:v="urn:schemas-microsoft-com:vml" xmlns:wp14="http://schemas.microsoft.com/office/word/2010/wordprocessingDrawing" xmlns:wp="http://schemas.openxmlformats.org/drawingml/2006/wordprocessingDrawing" xmlns:w10="urn:schemas-microsoft-com:office:word" xmlns:w="http://schemas.openxmlformats.org/wordprocessingml/2006/main" xmlns:w14="http://schemas.microsoft.com/office/word/2010/wordml" xmlns:w15="http://schemas.microsoft.com/office/word/2012/wordml" xmlns:w16cex="http://schemas.microsoft.com/office/word/2018/wordml/cex" xmlns:w16cid="http://schemas.microsoft.com/office/word/2016/wordml/cid" xmlns:w16="http://schemas.microsoft.com/office/word/2018/wordml" xmlns:w16du="http://schemas.microsoft.com/office/word/2023/wordml/word16du" xmlns:w16sdtdh="http://schemas.microsoft.com/office/word/2020/wordml/sdtdatahash" xmlns:w16sdtfl="http://schemas.microsoft.com/office/word/2024/wordml/sdtformatlock" xmlns:w16se="http://schemas.microsoft.com/office/word/2015/wordml/symex" xmlns:wpg="http://schemas.microsoft.com/office/word/2010/wordprocessingGroup" xmlns:wpi="http://schemas.microsoft.com/office/word/2010/wordprocessingInk" xmlns:wne="http://schemas.microsoft.com/office/word/2006/wordml" xmlns:wps="http://schemas.microsoft.com/office/word/2010/wordprocessingShape" mc:Ignorable="w14 w15 w16se w16cid w16 w16cex w16sdtdh w16sdtfl w16du wp14">
   <w:endnote w:type="separator" w:id="-1">
     <w:p>
-      <w:pPr>
-        <w:spacing w:after="0" w:line="240" w:lineRule="auto"/>
-      </w:pPr>
       <w:r>
         <w:separator/>
       </w:r>
@@ -152,9 +153,6 @@
   </w:endnote>
   <w:endnote w:type="continuationSeparator" w:id="0">
     <w:p>
-      <w:pPr>
-        <w:spacing w:after="0" w:line="240" w:lineRule="auto"/>
-      </w:pPr>
       <w:r>
         <w:continuationSeparator/>
       </w:r>
@@ -171,25 +169,13 @@
     </w:pPr>
     <w:r>
       <w:rPr>
-        <w:rFonts w:ascii="Times New Roman" w:eastAsia="DengXian" w:hAnsi="Times New Roman" w:cs="Arial"/>
-        <w:color w:val="808080"/>
-        <w:kern w:val="0"/>
-        <w:sz w:val="18"/>
-        <w:szCs w:val="18"/>
         <w:lang w:val="en-US" w:eastAsia="zh-CN"/>
-        <w14:ligatures w14:val="none"/>
       </w:rPr>
       <w:t xml:space="preserve">[PROJECT_TITLE] </w:t>
     </w:r>
     <w:r>
       <w:rPr>
-        <w:rFonts w:ascii="Times New Roman" w:eastAsia="DengXian" w:hAnsi="Times New Roman" w:cs="Arial"/>
-        <w:color w:val="808080"/>
-        <w:kern w:val="0"/>
-        <w:sz w:val="18"/>
-        <w:szCs w:val="18"/>
         <w:lang w:val="en-US" w:eastAsia="zh-CN"/>
-        <w14:ligatures w14:val="none"/>
       </w:rPr>
       <w:t>- Planning &amp; Design Document</w:t>
     </w:r>
@@ -201,61 +187,31 @@
     </w:r>
     <w:r>
       <w:rPr>
-        <w:rFonts w:ascii="Times New Roman" w:eastAsia="DengXian" w:hAnsi="Times New Roman" w:cs="Arial"/>
-        <w:color w:val="808080"/>
-        <w:kern w:val="0"/>
-        <w:sz w:val="18"/>
-        <w:szCs w:val="18"/>
         <w:lang w:val="en-US" w:eastAsia="zh-CN"/>
-        <w14:ligatures w14:val="none"/>
       </w:rPr>
       <w:fldChar w:fldCharType="begin"/>
     </w:r>
     <w:r>
       <w:rPr>
-        <w:rFonts w:ascii="Times New Roman" w:eastAsia="DengXian" w:hAnsi="Times New Roman" w:cs="Arial"/>
-        <w:color w:val="808080"/>
-        <w:kern w:val="0"/>
-        <w:sz w:val="18"/>
-        <w:szCs w:val="18"/>
         <w:lang w:val="en-US" w:eastAsia="zh-CN"/>
-        <w14:ligatures w14:val="none"/>
       </w:rPr>
       <w:instrText xml:space="preserve"> PAGE   \* MERGEFORMAT </w:instrText>
     </w:r>
     <w:r>
       <w:rPr>
-        <w:rFonts w:ascii="Times New Roman" w:eastAsia="DengXian" w:hAnsi="Times New Roman" w:cs="Arial"/>
-        <w:color w:val="808080"/>
-        <w:kern w:val="0"/>
-        <w:sz w:val="18"/>
-        <w:szCs w:val="18"/>
         <w:lang w:val="en-US" w:eastAsia="zh-CN"/>
-        <w14:ligatures w14:val="none"/>
       </w:rPr>
       <w:fldChar w:fldCharType="separate"/>
     </w:r>
     <w:r>
       <w:rPr>
-        <w:rFonts w:ascii="Times New Roman" w:eastAsia="DengXian" w:hAnsi="Times New Roman" w:cs="Arial"/>
-        <w:color w:val="808080"/>
-        <w:kern w:val="0"/>
-        <w:sz w:val="18"/>
-        <w:szCs w:val="18"/>
         <w:lang w:val="en-US" w:eastAsia="zh-CN"/>
-        <w14:ligatures w14:val="none"/>
       </w:rPr>
       <w:t>2</w:t>
     </w:r>
     <w:r>
       <w:rPr>
-        <w:rFonts w:ascii="Times New Roman" w:eastAsia="DengXian" w:hAnsi="Times New Roman" w:cs="Arial"/>
-        <w:color w:val="808080"/>
-        <w:kern w:val="0"/>
-        <w:sz w:val="18"/>
-        <w:szCs w:val="18"/>
         <w:lang w:val="en-US" w:eastAsia="zh-CN"/>
-        <w14:ligatures w14:val="none"/>
       </w:rPr>
       <w:fldChar w:fldCharType="end"/>
     </w:r>
@@ -267,9 +223,6 @@
 <w:footnotes xmlns:wpc="http://schemas.microsoft.com/office/word/2010/wordprocessingCanvas" xmlns:cx="http://schemas.microsoft.com/office/drawing/2014/chartex" xmlns:cx1="http://schemas.microsoft.com/office/drawing/2015/9/8/chartex" xmlns:cx2="http://schemas.microsoft.com/office/drawing/2015/10/21/chartex" xmlns:cx3="http://schemas.microsoft.com/office/drawing/2016/5/9/chartex" xmlns:cx4="http://schemas.microsoft.com/office/drawing/2016/5/10/chartex" xmlns:cx5="http://schemas.microsoft.com/office/drawing/2016/5/11/chartex" xmlns:cx6="http://schemas.microsoft.com/office/drawing/2016/5/12/chartex" xmlns:cx7="http://schemas.microsoft.com/office/drawing/2016/5/13/chartex" xmlns:cx8="http://schemas.microsoft.com/office/drawing/2016/5/14/chartex" xmlns:mc="http://schemas.openxmlformats.org/markup-compatibility/2006" xmlns:aink="http://schemas.microsoft.com/office/drawing/2016/ink" xmlns:am3d="http://schemas.microsoft.com/office/drawing/2017/model3d" xmlns:o="urn:schemas-microsoft-com:office:office" xmlns:oel="http://schemas.microsoft.com/office/2019/extlst" xmlns:r="http://schemas.openxmlformats.org/officeDocument/2006/relationships" xmlns:m="http://schemas.openxmlformats.org/officeDocument/2006/math" xmlns:v="urn:schemas-microsoft-com:vml" xmlns:wp14="http://schemas.microsoft.com/office/word/2010/wordprocessingDrawing" xmlns:wp="http://schemas.openxmlformats.org/drawingml/2006/wordprocessingDrawing" xmlns:w10="urn:schemas-microsoft-com:office:word" xmlns:w="http://schemas.openxmlformats.org/wordprocessingml/2006/main" xmlns:w14="http://schemas.microsoft.com/office/word/2010/wordml" xmlns:w15="http://schemas.microsoft.com/office/word/2012/wordml" xmlns:w16cex="http://schemas.microsoft.com/office/word/2018/wordml/cex" xmlns:w16cid="http://schemas.microsoft.com/office/word/2016/wordml/cid" xmlns:w16="http://schemas.microsoft.com/office/word/2018/wordml" xmlns:w16du="http://schemas.microsoft.com/office/word/2023/wordml/word16du" xmlns:w16sdtdh="http://schemas.microsoft.com/office/word/2020/wordml/sdtdatahash" xmlns:w16sdtfl="http://schemas.microsoft.com/office/word/2024/wordml/sdtformatlock" xmlns:w16se="http://schemas.microsoft.com/office/word/2015/wordml/symex" xmlns:wpg="http://schemas.microsoft.com/office/word/2010/wordprocessingGroup" xmlns:wpi="http://schemas.microsoft.com/office/word/2010/wordprocessingInk" xmlns:wne="http://schemas.microsoft.com/office/word/2006/wordml" xmlns:wps="http://schemas.microsoft.com/office/word/2010/wordprocessingShape" mc:Ignorable="w14 w15 w16se w16cid w16 w16cex w16sdtdh w16sdtfl w16du wp14">
   <w:footnote w:type="separator" w:id="-1">
     <w:p>
-      <w:pPr>
-        <w:spacing w:after="0" w:line="240" w:lineRule="auto"/>
-      </w:pPr>
       <w:r>
         <w:separator/>
       </w:r>
@@ -277,9 +230,6 @@
   </w:footnote>
   <w:footnote w:type="continuationSeparator" w:id="0">
     <w:p>
-      <w:pPr>
-        <w:spacing w:after="0" w:line="240" w:lineRule="auto"/>
-      </w:pPr>
       <w:r>
         <w:continuationSeparator/>
       </w:r>
@@ -1127,6 +1077,125 @@
     </w:lvl>
   </w:abstractNum>
   <w:abstractNum w:abstractNumId="7" w15:restartNumberingAfterBreak="0">
+    <w:nsid w:val="493D6C75"/>
+    <w:multiLevelType w:val="multilevel"/>
+    <w:tmpl w:val="E9CE0634"/>
+    <w:lvl w:ilvl="0">
+      <w:start w:val="1"/>
+      <w:numFmt w:val="decimal"/>
+      <w:pStyle w:val="Heading1"/>
+      <w:suff w:val="space"/>
+      <w:lvlText w:val="%1.0"/>
+      <w:lvlJc w:val="left"/>
+      <w:pPr>
+        <w:ind w:left="0" w:firstLine="0"/>
+      </w:pPr>
+      <w:rPr>
+        <w:rFonts w:hint="default"/>
+      </w:rPr>
+    </w:lvl>
+    <w:lvl w:ilvl="1">
+      <w:start w:val="1"/>
+      <w:numFmt w:val="decimal"/>
+      <w:pStyle w:val="Heading2"/>
+      <w:suff w:val="space"/>
+      <w:lvlText w:val="%1.%2"/>
+      <w:lvlJc w:val="left"/>
+      <w:pPr>
+        <w:ind w:left="0" w:firstLine="0"/>
+      </w:pPr>
+      <w:rPr>
+        <w:rFonts w:hint="default"/>
+      </w:rPr>
+    </w:lvl>
+    <w:lvl w:ilvl="2">
+      <w:start w:val="1"/>
+      <w:numFmt w:val="decimal"/>
+      <w:pStyle w:val="Heading3"/>
+      <w:suff w:val="space"/>
+      <w:lvlText w:val="%1.%2.%3"/>
+      <w:lvlJc w:val="left"/>
+      <w:pPr>
+        <w:ind w:left="0" w:firstLine="0"/>
+      </w:pPr>
+      <w:rPr>
+        <w:rFonts w:hint="default"/>
+      </w:rPr>
+    </w:lvl>
+    <w:lvl w:ilvl="3">
+      <w:start w:val="1"/>
+      <w:numFmt w:val="decimal"/>
+      <w:lvlText w:val="(%4)"/>
+      <w:lvlJc w:val="left"/>
+      <w:pPr>
+        <w:ind w:left="1440" w:hanging="360"/>
+      </w:pPr>
+      <w:rPr>
+        <w:rFonts w:hint="default"/>
+      </w:rPr>
+    </w:lvl>
+    <w:lvl w:ilvl="4">
+      <w:start w:val="1"/>
+      <w:numFmt w:val="lowerLetter"/>
+      <w:lvlText w:val="(%5)"/>
+      <w:lvlJc w:val="left"/>
+      <w:pPr>
+        <w:ind w:left="1800" w:hanging="360"/>
+      </w:pPr>
+      <w:rPr>
+        <w:rFonts w:hint="default"/>
+      </w:rPr>
+    </w:lvl>
+    <w:lvl w:ilvl="5">
+      <w:start w:val="1"/>
+      <w:numFmt w:val="lowerRoman"/>
+      <w:lvlText w:val="(%6)"/>
+      <w:lvlJc w:val="left"/>
+      <w:pPr>
+        <w:ind w:left="2160" w:hanging="360"/>
+      </w:pPr>
+      <w:rPr>
+        <w:rFonts w:hint="default"/>
+      </w:rPr>
+    </w:lvl>
+    <w:lvl w:ilvl="6">
+      <w:start w:val="1"/>
+      <w:numFmt w:val="decimal"/>
+      <w:lvlText w:val="%7."/>
+      <w:lvlJc w:val="left"/>
+      <w:pPr>
+        <w:ind w:left="2520" w:hanging="360"/>
+      </w:pPr>
+      <w:rPr>
+        <w:rFonts w:hint="default"/>
+      </w:rPr>
+    </w:lvl>
+    <w:lvl w:ilvl="7">
+      <w:start w:val="1"/>
+      <w:numFmt w:val="lowerLetter"/>
+      <w:lvlText w:val="%8."/>
+      <w:lvlJc w:val="left"/>
+      <w:pPr>
+        <w:ind w:left="2880" w:hanging="360"/>
+      </w:pPr>
+      <w:rPr>
+        <w:rFonts w:hint="default"/>
+      </w:rPr>
+    </w:lvl>
+    <w:lvl w:ilvl="8">
+      <w:start w:val="1"/>
+      <w:numFmt w:val="lowerRoman"/>
+      <w:lvlText w:val="%9."/>
+      <w:lvlJc w:val="left"/>
+      <w:pPr>
+        <w:ind w:left="3240" w:hanging="360"/>
+      </w:pPr>
+      <w:rPr>
+        <w:rFonts w:hint="default"/>
+      </w:rPr>
+    </w:lvl>
+  </w:abstractNum>
+  <w:abstractNum w:abstractNumId="8" w15:restartNumberingAfterBreak="0">
     <w:nsid w:val="5593427B"/>
     <w:multiLevelType w:val="hybridMultilevel"/>
     <w:tmpl w:val="72FCAAE4"/>
@@ -1215,7 +1284,7 @@
       </w:pPr>
     </w:lvl>
   </w:abstractNum>
-  <w:abstractNum w:abstractNumId="8" w15:restartNumberingAfterBreak="0">
+  <w:abstractNum w:abstractNumId="9" w15:restartNumberingAfterBreak="0">
     <w:nsid w:val="57454A9C"/>
     <w:multiLevelType w:val="hybridMultilevel"/>
     <w:tmpl w:val="159085AC"/>
@@ -1328,7 +1397,7 @@
       </w:rPr>
     </w:lvl>
   </w:abstractNum>
-  <w:abstractNum w:abstractNumId="9" w15:restartNumberingAfterBreak="0">
+  <w:abstractNum w:abstractNumId="10" w15:restartNumberingAfterBreak="0">
     <w:nsid w:val="57F929E6"/>
     <w:multiLevelType w:val="hybridMultilevel"/>
     <w:tmpl w:val="358EDC70"/>
@@ -1441,7 +1510,7 @@
       </w:rPr>
     </w:lvl>
   </w:abstractNum>
-  <w:abstractNum w:abstractNumId="10" w15:restartNumberingAfterBreak="0">
+  <w:abstractNum w:abstractNumId="11" w15:restartNumberingAfterBreak="0">
     <w:nsid w:val="5ABE6AB1"/>
     <w:multiLevelType w:val="hybridMultilevel"/>
     <w:tmpl w:val="C66244E2"/>
@@ -1554,7 +1623,7 @@
       </w:rPr>
     </w:lvl>
   </w:abstractNum>
-  <w:abstractNum w:abstractNumId="11" w15:restartNumberingAfterBreak="0">
+  <w:abstractNum w:abstractNumId="12" w15:restartNumberingAfterBreak="0">
     <w:nsid w:val="5D303F1F"/>
     <w:multiLevelType w:val="hybridMultilevel"/>
     <w:tmpl w:val="AA9A4230"/>
@@ -1667,7 +1736,7 @@
       </w:rPr>
     </w:lvl>
   </w:abstractNum>
-  <w:abstractNum w:abstractNumId="12" w15:restartNumberingAfterBreak="0">
+  <w:abstractNum w:abstractNumId="13" w15:restartNumberingAfterBreak="0">
     <w:nsid w:val="60741FE3"/>
     <w:multiLevelType w:val="multilevel"/>
     <w:tmpl w:val="804C42A6"/>
@@ -1794,7 +1863,7 @@
       </w:rPr>
     </w:lvl>
   </w:abstractNum>
-  <w:abstractNum w:abstractNumId="13" w15:restartNumberingAfterBreak="0">
+  <w:abstractNum w:abstractNumId="14" w15:restartNumberingAfterBreak="0">
     <w:nsid w:val="61B1156A"/>
     <w:multiLevelType w:val="hybridMultilevel"/>
     <w:tmpl w:val="8FB0D5C8"/>
@@ -1907,7 +1976,7 @@
       </w:rPr>
     </w:lvl>
   </w:abstractNum>
-  <w:abstractNum w:abstractNumId="14" w15:restartNumberingAfterBreak="0">
+  <w:abstractNum w:abstractNumId="15" w15:restartNumberingAfterBreak="0">
     <w:nsid w:val="620D6B55"/>
     <w:multiLevelType w:val="hybridMultilevel"/>
     <w:tmpl w:val="EB60673C"/>
@@ -2020,7 +2089,7 @@
       </w:rPr>
     </w:lvl>
   </w:abstractNum>
-  <w:abstractNum w:abstractNumId="15" w15:restartNumberingAfterBreak="0">
+  <w:abstractNum w:abstractNumId="16" w15:restartNumberingAfterBreak="0">
     <w:nsid w:val="63BA21CC"/>
     <w:multiLevelType w:val="hybridMultilevel"/>
     <w:tmpl w:val="ABD202A6"/>
@@ -2133,7 +2202,7 @@
       </w:rPr>
     </w:lvl>
   </w:abstractNum>
-  <w:abstractNum w:abstractNumId="16" w15:restartNumberingAfterBreak="0">
+  <w:abstractNum w:abstractNumId="17" w15:restartNumberingAfterBreak="0">
     <w:nsid w:val="6690742A"/>
     <w:multiLevelType w:val="hybridMultilevel"/>
     <w:tmpl w:val="6EE6D130"/>
@@ -2246,7 +2315,7 @@
       </w:rPr>
     </w:lvl>
   </w:abstractNum>
-  <w:abstractNum w:abstractNumId="17" w15:restartNumberingAfterBreak="0">
+  <w:abstractNum w:abstractNumId="18" w15:restartNumberingAfterBreak="0">
     <w:nsid w:val="67190061"/>
     <w:multiLevelType w:val="hybridMultilevel"/>
     <w:tmpl w:val="52F4BD80"/>
@@ -2359,7 +2428,7 @@
       </w:rPr>
     </w:lvl>
   </w:abstractNum>
-  <w:abstractNum w:abstractNumId="18" w15:restartNumberingAfterBreak="0">
+  <w:abstractNum w:abstractNumId="19" w15:restartNumberingAfterBreak="0">
     <w:nsid w:val="6807EAC5"/>
     <w:multiLevelType w:val="hybridMultilevel"/>
     <w:tmpl w:val="965A872C"/>
@@ -2472,7 +2541,7 @@
       </w:rPr>
     </w:lvl>
   </w:abstractNum>
-  <w:abstractNum w:abstractNumId="19" w15:restartNumberingAfterBreak="0">
+  <w:abstractNum w:abstractNumId="20" w15:restartNumberingAfterBreak="0">
     <w:nsid w:val="6B691A91"/>
     <w:multiLevelType w:val="hybridMultilevel"/>
     <w:tmpl w:val="FFFFFFFF"/>
@@ -2585,7 +2654,7 @@
       </w:rPr>
     </w:lvl>
   </w:abstractNum>
-  <w:abstractNum w:abstractNumId="20" w15:restartNumberingAfterBreak="0">
+  <w:abstractNum w:abstractNumId="21" w15:restartNumberingAfterBreak="0">
     <w:nsid w:val="6F125796"/>
     <w:multiLevelType w:val="hybridMultilevel"/>
     <w:tmpl w:val="C6AE9A3E"/>
@@ -2698,7 +2767,7 @@
       </w:rPr>
     </w:lvl>
   </w:abstractNum>
-  <w:abstractNum w:abstractNumId="21" w15:restartNumberingAfterBreak="0">
+  <w:abstractNum w:abstractNumId="22" w15:restartNumberingAfterBreak="0">
     <w:nsid w:val="792E24A2"/>
     <w:multiLevelType w:val="hybridMultilevel"/>
     <w:tmpl w:val="EDAC9E06"/>
@@ -2812,19 +2881,19 @@
     </w:lvl>
   </w:abstractNum>
   <w:num w:numId="1" w16cid:durableId="1284337513">
-    <w:abstractNumId w:val="12"/>
+    <w:abstractNumId w:val="13"/>
   </w:num>
   <w:num w:numId="2" w16cid:durableId="821317718">
     <w:abstractNumId w:val="4"/>
   </w:num>
   <w:num w:numId="3" w16cid:durableId="464926961">
+    <w:abstractNumId w:val="20"/>
+  </w:num>
+  <w:num w:numId="4" w16cid:durableId="1129125088">
     <w:abstractNumId w:val="19"/>
   </w:num>
-  <w:num w:numId="4" w16cid:durableId="1129125088">
-    <w:abstractNumId w:val="18"/>
-  </w:num>
   <w:num w:numId="5" w16cid:durableId="1500534509">
-    <w:abstractNumId w:val="12"/>
+    <w:abstractNumId w:val="13"/>
     <w:lvlOverride w:ilvl="0">
       <w:lvl w:ilvl="0">
         <w:start w:val="1"/>
@@ -2970,25 +3039,25 @@
     <w:abstractNumId w:val="1"/>
   </w:num>
   <w:num w:numId="7" w16cid:durableId="66808394">
-    <w:abstractNumId w:val="13"/>
+    <w:abstractNumId w:val="14"/>
   </w:num>
   <w:num w:numId="8" w16cid:durableId="1268584124">
-    <w:abstractNumId w:val="21"/>
+    <w:abstractNumId w:val="22"/>
   </w:num>
   <w:num w:numId="9" w16cid:durableId="1477911719">
-    <w:abstractNumId w:val="16"/>
+    <w:abstractNumId w:val="17"/>
   </w:num>
   <w:num w:numId="10" w16cid:durableId="1187407567">
     <w:abstractNumId w:val="2"/>
   </w:num>
   <w:num w:numId="11" w16cid:durableId="580062758">
+    <w:abstractNumId w:val="16"/>
+  </w:num>
+  <w:num w:numId="12" w16cid:durableId="586039578">
     <w:abstractNumId w:val="15"/>
   </w:num>
-  <w:num w:numId="12" w16cid:durableId="586039578">
-    <w:abstractNumId w:val="14"/>
-  </w:num>
   <w:num w:numId="13" w16cid:durableId="1900895974">
-    <w:abstractNumId w:val="9"/>
+    <w:abstractNumId w:val="10"/>
   </w:num>
   <w:num w:numId="14" w16cid:durableId="1927110550">
     <w:abstractNumId w:val="5"/>
@@ -2997,19 +3066,19 @@
     <w:abstractNumId w:val="6"/>
   </w:num>
   <w:num w:numId="16" w16cid:durableId="158350122">
-    <w:abstractNumId w:val="20"/>
+    <w:abstractNumId w:val="21"/>
   </w:num>
   <w:num w:numId="17" w16cid:durableId="1929120718">
-    <w:abstractNumId w:val="10"/>
+    <w:abstractNumId w:val="11"/>
   </w:num>
   <w:num w:numId="18" w16cid:durableId="832187681">
-    <w:abstractNumId w:val="11"/>
+    <w:abstractNumId w:val="12"/>
   </w:num>
   <w:num w:numId="19" w16cid:durableId="1808931457">
-    <w:abstractNumId w:val="8"/>
+    <w:abstractNumId w:val="9"/>
   </w:num>
   <w:num w:numId="20" w16cid:durableId="2029288212">
-    <w:abstractNumId w:val="17"/>
+    <w:abstractNumId w:val="18"/>
   </w:num>
   <w:num w:numId="21" w16cid:durableId="948707426">
     <w:abstractNumId w:val="3"/>
@@ -3018,6 +3087,9 @@
     <w:abstractNumId w:val="0"/>
   </w:num>
   <w:num w:numId="23" w16cid:durableId="1784835363">
+    <w:abstractNumId w:val="8"/>
+  </w:num>
+  <w:num w:numId="24" w16cid:durableId="744570198">
     <w:abstractNumId w:val="7"/>
   </w:num>
 </w:numbering>
@@ -3423,7 +3495,12 @@
   <w:style w:type="paragraph" w:default="1" w:styleId="Normal">
     <w:name w:val="Normal"/>
     <w:qFormat/>
-    <w:rsid w:val="000738C4"/>
+    <w:rsid w:val="00AE58AA"/>
+    <w:rPr>
+      <w:rFonts w:ascii="Segoe UI" w:hAnsi="Segoe UI" w:cs="Segoe UI"/>
+      <w:sz w:val="22"/>
+      <w:szCs w:val="22"/>
+    </w:rPr>
   </w:style>
   <w:style w:type="paragraph" w:styleId="Heading1">
     <w:name w:val="heading 1"/>
@@ -3432,18 +3509,21 @@
     <w:link w:val="Heading1Char"/>
     <w:uiPriority w:val="9"/>
     <w:qFormat/>
-    <w:rsid w:val="001D1EC1"/>
+    <w:rsid w:val="00AA0D91"/>
     <w:pPr>
       <w:keepNext/>
       <w:keepLines/>
+      <w:numPr>
+        <w:numId w:val="24"/>
+      </w:numPr>
       <w:spacing w:before="360" w:after="80"/>
       <w:outlineLvl w:val="0"/>
     </w:pPr>
     <w:rPr>
-      <w:rFonts w:asciiTheme="majorHAnsi" w:eastAsiaTheme="majorEastAsia" w:hAnsiTheme="majorHAnsi" w:cstheme="majorBidi"/>
+      <w:rFonts w:eastAsiaTheme="majorEastAsia"/>
       <w:color w:val="0F4761" w:themeColor="accent1" w:themeShade="BF"/>
-      <w:sz w:val="40"/>
-      <w:szCs w:val="40"/>
+      <w:sz w:val="30"/>
+      <w:szCs w:val="30"/>
     </w:rPr>
   </w:style>
   <w:style w:type="paragraph" w:styleId="Heading2">
@@ -3454,18 +3534,22 @@
     <w:uiPriority w:val="9"/>
     <w:unhideWhenUsed/>
     <w:qFormat/>
-    <w:rsid w:val="001D1EC1"/>
+    <w:rsid w:val="00AA0D91"/>
     <w:pPr>
       <w:keepNext/>
       <w:keepLines/>
+      <w:numPr>
+        <w:ilvl w:val="1"/>
+        <w:numId w:val="24"/>
+      </w:numPr>
       <w:spacing w:before="160" w:after="80"/>
       <w:outlineLvl w:val="1"/>
     </w:pPr>
     <w:rPr>
-      <w:rFonts w:asciiTheme="majorHAnsi" w:eastAsiaTheme="majorEastAsia" w:hAnsiTheme="majorHAnsi" w:cstheme="majorBidi"/>
+      <w:rFonts w:eastAsiaTheme="majorEastAsia"/>
       <w:color w:val="0F4761" w:themeColor="accent1" w:themeShade="BF"/>
-      <w:sz w:val="32"/>
-      <w:szCs w:val="32"/>
+      <w:sz w:val="28"/>
+      <w:szCs w:val="28"/>
     </w:rPr>
   </w:style>
   <w:style w:type="paragraph" w:styleId="Heading3">
@@ -3476,18 +3560,22 @@
     <w:uiPriority w:val="9"/>
     <w:unhideWhenUsed/>
     <w:qFormat/>
-    <w:rsid w:val="001D1EC1"/>
+    <w:rsid w:val="00AA0D91"/>
     <w:pPr>
       <w:keepNext/>
       <w:keepLines/>
+      <w:numPr>
+        <w:ilvl w:val="2"/>
+        <w:numId w:val="24"/>
+      </w:numPr>
       <w:spacing w:before="160" w:after="80"/>
       <w:outlineLvl w:val="2"/>
     </w:pPr>
     <w:rPr>
-      <w:rFonts w:eastAsiaTheme="majorEastAsia" w:cstheme="majorBidi"/>
+      <w:rFonts w:eastAsiaTheme="majorEastAsia"/>
       <w:color w:val="0F4761" w:themeColor="accent1" w:themeShade="BF"/>
-      <w:sz w:val="28"/>
-      <w:szCs w:val="28"/>
+      <w:sz w:val="26"/>
+      <w:szCs w:val="26"/>
     </w:rPr>
   </w:style>
   <w:style w:type="paragraph" w:styleId="Heading4">
@@ -3498,7 +3586,7 @@
     <w:uiPriority w:val="9"/>
     <w:unhideWhenUsed/>
     <w:qFormat/>
-    <w:rsid w:val="001D1EC1"/>
+    <w:rsid w:val="00AA0D91"/>
     <w:pPr>
       <w:keepNext/>
       <w:keepLines/>
@@ -3506,9 +3594,7 @@
       <w:outlineLvl w:val="3"/>
     </w:pPr>
     <w:rPr>
-      <w:rFonts w:eastAsiaTheme="majorEastAsia" w:cstheme="majorBidi"/>
-      <w:i/>
-      <w:iCs/>
+      <w:rFonts w:eastAsiaTheme="majorEastAsia"/>
       <w:color w:val="0F4761" w:themeColor="accent1" w:themeShade="BF"/>
     </w:rPr>
   </w:style>
@@ -3518,10 +3604,9 @@
     <w:next w:val="Normal"/>
     <w:link w:val="Heading5Char"/>
     <w:uiPriority w:val="9"/>
-    <w:semiHidden/>
     <w:unhideWhenUsed/>
     <w:qFormat/>
-    <w:rsid w:val="001D1EC1"/>
+    <w:rsid w:val="00AA0D91"/>
     <w:pPr>
       <w:keepNext/>
       <w:keepLines/>
@@ -3529,7 +3614,7 @@
       <w:outlineLvl w:val="4"/>
     </w:pPr>
     <w:rPr>
-      <w:rFonts w:eastAsiaTheme="majorEastAsia" w:cstheme="majorBidi"/>
+      <w:rFonts w:eastAsiaTheme="majorEastAsia"/>
       <w:color w:val="0F4761" w:themeColor="accent1" w:themeShade="BF"/>
     </w:rPr>
   </w:style>
@@ -3653,12 +3738,12 @@
     <w:basedOn w:val="DefaultParagraphFont"/>
     <w:link w:val="Heading1"/>
     <w:uiPriority w:val="9"/>
-    <w:rsid w:val="001D1EC1"/>
+    <w:rsid w:val="00AA0D91"/>
     <w:rPr>
-      <w:rFonts w:asciiTheme="majorHAnsi" w:eastAsiaTheme="majorEastAsia" w:hAnsiTheme="majorHAnsi" w:cstheme="majorBidi"/>
+      <w:rFonts w:ascii="Segoe UI" w:eastAsiaTheme="majorEastAsia" w:hAnsi="Segoe UI" w:cs="Segoe UI"/>
       <w:color w:val="0F4761" w:themeColor="accent1" w:themeShade="BF"/>
-      <w:sz w:val="40"/>
-      <w:szCs w:val="40"/>
+      <w:sz w:val="30"/>
+      <w:szCs w:val="30"/>
     </w:rPr>
   </w:style>
   <w:style w:type="character" w:customStyle="1" w:styleId="Heading2Char">
@@ -3666,12 +3751,12 @@
     <w:basedOn w:val="DefaultParagraphFont"/>
     <w:link w:val="Heading2"/>
     <w:uiPriority w:val="9"/>
-    <w:rsid w:val="001D1EC1"/>
+    <w:rsid w:val="00AA0D91"/>
     <w:rPr>
-      <w:rFonts w:asciiTheme="majorHAnsi" w:eastAsiaTheme="majorEastAsia" w:hAnsiTheme="majorHAnsi" w:cstheme="majorBidi"/>
+      <w:rFonts w:ascii="Segoe UI" w:eastAsiaTheme="majorEastAsia" w:hAnsi="Segoe UI" w:cs="Segoe UI"/>
       <w:color w:val="0F4761" w:themeColor="accent1" w:themeShade="BF"/>
-      <w:sz w:val="32"/>
-      <w:szCs w:val="32"/>
+      <w:sz w:val="28"/>
+      <w:szCs w:val="28"/>
     </w:rPr>
   </w:style>
   <w:style w:type="character" w:customStyle="1" w:styleId="Heading3Char">
@@ -3679,12 +3764,12 @@
     <w:basedOn w:val="DefaultParagraphFont"/>
     <w:link w:val="Heading3"/>
     <w:uiPriority w:val="9"/>
-    <w:rsid w:val="001D1EC1"/>
+    <w:rsid w:val="00AA0D91"/>
     <w:rPr>
-      <w:rFonts w:eastAsiaTheme="majorEastAsia" w:cstheme="majorBidi"/>
+      <w:rFonts w:ascii="Segoe UI" w:eastAsiaTheme="majorEastAsia" w:hAnsi="Segoe UI" w:cs="Segoe UI"/>
       <w:color w:val="0F4761" w:themeColor="accent1" w:themeShade="BF"/>
-      <w:sz w:val="28"/>
-      <w:szCs w:val="28"/>
+      <w:sz w:val="26"/>
+      <w:szCs w:val="26"/>
     </w:rPr>
   </w:style>
   <w:style w:type="character" w:customStyle="1" w:styleId="Heading4Char">
@@ -3692,11 +3777,9 @@
     <w:basedOn w:val="DefaultParagraphFont"/>
     <w:link w:val="Heading4"/>
     <w:uiPriority w:val="9"/>
-    <w:rsid w:val="001D1EC1"/>
+    <w:rsid w:val="00AA0D91"/>
     <w:rPr>
-      <w:rFonts w:eastAsiaTheme="majorEastAsia" w:cstheme="majorBidi"/>
-      <w:i/>
-      <w:iCs/>
+      <w:rFonts w:ascii="Segoe UI" w:eastAsiaTheme="majorEastAsia" w:hAnsi="Segoe UI" w:cs="Segoe UI"/>
       <w:color w:val="0F4761" w:themeColor="accent1" w:themeShade="BF"/>
     </w:rPr>
   </w:style>
@@ -3705,11 +3788,12 @@
     <w:basedOn w:val="DefaultParagraphFont"/>
     <w:link w:val="Heading5"/>
     <w:uiPriority w:val="9"/>
-    <w:semiHidden/>
-    <w:rsid w:val="001D1EC1"/>
+    <w:rsid w:val="00AA0D91"/>
     <w:rPr>
-      <w:rFonts w:eastAsiaTheme="majorEastAsia" w:cstheme="majorBidi"/>
+      <w:rFonts w:ascii="Segoe UI" w:eastAsiaTheme="majorEastAsia" w:hAnsi="Segoe UI" w:cs="Segoe UI"/>
       <w:color w:val="0F4761" w:themeColor="accent1" w:themeShade="BF"/>
+      <w:sz w:val="22"/>
+      <w:szCs w:val="22"/>
     </w:rPr>
   </w:style>
   <w:style w:type="character" w:customStyle="1" w:styleId="Heading6Char">
@@ -6101,16 +6185,10 @@
 </file>
 
 <file path=customXml/item1.xml><?xml version="1.0" encoding="utf-8"?>
-<p:properties xmlns:p="http://schemas.microsoft.com/office/2006/metadata/properties" xmlns:xsi="http://www.w3.org/2001/XMLSchema-instance" xmlns:pc="http://schemas.microsoft.com/office/infopath/2007/PartnerControls">
-  <documentManagement/>
-</p:properties>
+<b:Sources xmlns:b="http://schemas.openxmlformats.org/officeDocument/2006/bibliography" xmlns="http://schemas.openxmlformats.org/officeDocument/2006/bibliography" SelectedStyle="\APASixthEditionOfficeOnline.xsl" StyleName="APA" Version="6"/>
 </file>
 
 <file path=customXml/item2.xml><?xml version="1.0" encoding="utf-8"?>
-<b:Sources xmlns:b="http://schemas.openxmlformats.org/officeDocument/2006/bibliography" xmlns="http://schemas.openxmlformats.org/officeDocument/2006/bibliography" SelectedStyle="\APASixthEditionOfficeOnline.xsl" StyleName="APA" Version="6"/>
-</file>
-
-<file path=customXml/item3.xml><?xml version="1.0" encoding="utf-8"?>
 <ct:contentTypeSchema xmlns:ct="http://schemas.microsoft.com/office/2006/metadata/contentType" xmlns:ma="http://schemas.microsoft.com/office/2006/metadata/properties/metaAttributes" ct:_="" ma:_="" ma:contentTypeName="Document" ma:contentTypeID="0x01010085C90FEABA01574E94F222950F0C31FD" ma:contentTypeVersion="3" ma:contentTypeDescription="Create a new document." ma:contentTypeScope="" ma:versionID="3f74f9d818e6377a773cce7d698d7e32">
   <xsd:schema xmlns:xsd="http://www.w3.org/2001/XMLSchema" xmlns:xs="http://www.w3.org/2001/XMLSchema" xmlns:p="http://schemas.microsoft.com/office/2006/metadata/properties" xmlns:ns2="c10ce1e6-2e59-43d6-bc20-07a30a27bcae" targetNamespace="http://schemas.microsoft.com/office/2006/metadata/properties" ma:root="true" ma:fieldsID="3e16b53508b9ffbab11f7b130802d601" ns2:_="">
     <xsd:import namespace="c10ce1e6-2e59-43d6-bc20-07a30a27bcae"/>
@@ -6248,7 +6326,7 @@
 </ct:contentTypeSchema>
 </file>
 
-<file path=customXml/item4.xml><?xml version="1.0" encoding="utf-8"?>
+<file path=customXml/item3.xml><?xml version="1.0" encoding="utf-8"?>
 <?mso-contentType ?>
 <FormTemplates xmlns="http://schemas.microsoft.com/sharepoint/v3/contenttype/forms">
   <Display>DocumentLibraryForm</Display>
@@ -6257,16 +6335,13 @@
 </FormTemplates>
 </file>
 
-<file path=customXml/itemProps1.xml><?xml version="1.0" encoding="utf-8"?>
-<ds:datastoreItem xmlns:ds="http://schemas.openxmlformats.org/officeDocument/2006/customXml" ds:itemID="{8F70B746-9169-4A9D-BAEC-CBE74BD2F9DF}">
-  <ds:schemaRefs>
-    <ds:schemaRef ds:uri="http://schemas.microsoft.com/office/2006/metadata/properties"/>
-    <ds:schemaRef ds:uri="http://schemas.microsoft.com/office/infopath/2007/PartnerControls"/>
-  </ds:schemaRefs>
-</ds:datastoreItem>
+<file path=customXml/item4.xml><?xml version="1.0" encoding="utf-8"?>
+<p:properties xmlns:p="http://schemas.microsoft.com/office/2006/metadata/properties" xmlns:xsi="http://www.w3.org/2001/XMLSchema-instance" xmlns:pc="http://schemas.microsoft.com/office/infopath/2007/PartnerControls">
+  <documentManagement/>
+</p:properties>
 </file>
 
-<file path=customXml/itemProps2.xml><?xml version="1.0" encoding="utf-8"?>
+<file path=customXml/itemProps1.xml><?xml version="1.0" encoding="utf-8"?>
 <ds:datastoreItem xmlns:ds="http://schemas.openxmlformats.org/officeDocument/2006/customXml" ds:itemID="{A82C1AF4-78FE-4587-AE7C-939CDDF82EB3}">
   <ds:schemaRefs>
     <ds:schemaRef ds:uri="http://schemas.openxmlformats.org/officeDocument/2006/bibliography"/>
@@ -6274,7 +6349,7 @@
 </ds:datastoreItem>
 </file>
 
-<file path=customXml/itemProps3.xml><?xml version="1.0" encoding="utf-8"?>
+<file path=customXml/itemProps2.xml><?xml version="1.0" encoding="utf-8"?>
 <ds:datastoreItem xmlns:ds="http://schemas.openxmlformats.org/officeDocument/2006/customXml" ds:itemID="{FA55BFAA-E444-45BB-B8D0-8563BE85B483}">
   <ds:schemaRefs>
     <ds:schemaRef ds:uri="http://schemas.microsoft.com/office/2006/metadata/contentType"/>
@@ -6292,10 +6367,19 @@
 </ds:datastoreItem>
 </file>
 
-<file path=customXml/itemProps4.xml><?xml version="1.0" encoding="utf-8"?>
+<file path=customXml/itemProps3.xml><?xml version="1.0" encoding="utf-8"?>
 <ds:datastoreItem xmlns:ds="http://schemas.openxmlformats.org/officeDocument/2006/customXml" ds:itemID="{C93A1584-1F3A-44D1-A14E-32307374A481}">
   <ds:schemaRefs>
     <ds:schemaRef ds:uri="http://schemas.microsoft.com/sharepoint/v3/contenttype/forms"/>
   </ds:schemaRefs>
 </ds:datastoreItem>
+</file>
+
+<file path=customXml/itemProps4.xml><?xml version="1.0" encoding="utf-8"?>
+<ds:datastoreItem xmlns:ds="http://schemas.openxmlformats.org/officeDocument/2006/customXml" ds:itemID="{8F70B746-9169-4A9D-BAEC-CBE74BD2F9DF}">
+  <ds:schemaRefs>
+    <ds:schemaRef ds:uri="http://schemas.microsoft.com/office/2006/metadata/properties"/>
+    <ds:schemaRef ds:uri="http://schemas.microsoft.com/office/infopath/2007/PartnerControls"/>
+  </ds:schemaRefs>
+</ds:datastoreItem>
 </file>
</xml_diff>